<commit_message>
Template and mobile UI
</commit_message>
<xml_diff>
--- a/Henk templates/Admission template.docx
+++ b/Henk templates/Admission template.docx
@@ -774,64 +774,7 @@
         </w:tc>
       </w:tr>
     </w:tbl>
-    <w:p>
-      <w:r>
-        <w:rPr>
-          <w:noProof/>
-        </w:rPr>
-        <w:drawing>
-          <wp:anchor distT="0" distB="0" distL="114300" distR="114300" simplePos="0" relativeHeight="251659264" behindDoc="1" locked="0" layoutInCell="1" allowOverlap="1" wp14:anchorId="05ABD5D1" wp14:editId="468E13FA">
-            <wp:simplePos x="0" y="0"/>
-            <wp:positionH relativeFrom="column">
-              <wp:posOffset>3846611</wp:posOffset>
-            </wp:positionH>
-            <wp:positionV relativeFrom="paragraph">
-              <wp:posOffset>1727025</wp:posOffset>
-            </wp:positionV>
-            <wp:extent cx="3868811" cy="3707354"/>
-            <wp:effectExtent l="596900" t="647700" r="576580" b="636270"/>
-            <wp:wrapNone/>
-            <wp:docPr id="454031202" name="Picture 5" descr="A logo with text in a circle&#10;&#10;AI-generated content may be incorrect."/>
-            <wp:cNvGraphicFramePr>
-              <a:graphicFrameLocks xmlns:a="http://schemas.openxmlformats.org/drawingml/2006/main" noChangeAspect="1"/>
-            </wp:cNvGraphicFramePr>
-            <a:graphic xmlns:a="http://schemas.openxmlformats.org/drawingml/2006/main">
-              <a:graphicData uri="http://schemas.openxmlformats.org/drawingml/2006/picture">
-                <pic:pic xmlns:pic="http://schemas.openxmlformats.org/drawingml/2006/picture">
-                  <pic:nvPicPr>
-                    <pic:cNvPr id="454031202" name="Picture 5" descr="A logo with text in a circle&#10;&#10;AI-generated content may be incorrect."/>
-                    <pic:cNvPicPr/>
-                  </pic:nvPicPr>
-                  <pic:blipFill>
-                    <a:blip r:embed="rId8">
-                      <a:alphaModFix amt="35000"/>
-                    </a:blip>
-                    <a:stretch>
-                      <a:fillRect/>
-                    </a:stretch>
-                  </pic:blipFill>
-                  <pic:spPr>
-                    <a:xfrm rot="20129403">
-                      <a:off x="0" y="0"/>
-                      <a:ext cx="3868811" cy="3707354"/>
-                    </a:xfrm>
-                    <a:prstGeom prst="rect">
-                      <a:avLst/>
-                    </a:prstGeom>
-                  </pic:spPr>
-                </pic:pic>
-              </a:graphicData>
-            </a:graphic>
-            <wp14:sizeRelH relativeFrom="page">
-              <wp14:pctWidth>0</wp14:pctWidth>
-            </wp14:sizeRelH>
-            <wp14:sizeRelV relativeFrom="page">
-              <wp14:pctHeight>0</wp14:pctHeight>
-            </wp14:sizeRelV>
-          </wp:anchor>
-        </w:drawing>
-      </w:r>
-    </w:p>
+    <w:p/>
     <w:sectPr>
       <w:type w:val="continuous"/>
       <w:pgSz w:w="11906" w:h="16838"/>

</xml_diff>